<commit_message>
feat: classification visible everywhere - Phase 3 completes the department architecture
D5 surfacing plus the D4 cleanup:
- DepartmentChip on main Issues cards and Board cards (renders
  nothing for unclassified work - general work stays visually quiet)
- Issue slideout: Department/Workstream controlled selectors from the
  catalog (D2 - never free text); changing department clears the stale
  workstream, matching the server rule; changes stay audited
- WORKSTREAM_LABEL_KEYS reuses the existing sidebar i18n keys rather
  than inventing strings; invariant tests assert every catalog
  workstream has a key and every key resolves in en.json
- D4 legacy-label fallback removed: the backfill classified existing
  rows and creation stamps the fields, so labels carry no structure
- Projects, Issues & Boards support guide regenerated to v1.1 in this
  same PR per the docs versioning rule
- 348 tests green
</commit_message>
<xml_diff>
--- a/docs/support/ONEKOF_SUPPORT_GUIDE_PROJECTS_ISSUES_BOARDS.docx
+++ b/docs/support/ONEKOF_SUPPORT_GUIDE_PROJECTS_ISSUES_BOARDS.docx
@@ -109,7 +109,7 @@
           <w:sz w:val="21"/>
           <w:szCs w:val="21"/>
         </w:rPr>
-        <w:t xml:space="preserve">Version 1.0 · July 25, 2026</w:t>
+        <w:t xml:space="preserve">Version 1.1 · July 25, 2026</w:t>
       </w:r>
     </w:p>
     <w:p>
@@ -875,6 +875,32 @@
           <w:sz w:val="21"/>
           <w:szCs w:val="21"/>
         </w:rPr>
+        <w:t xml:space="preserve">Department &amp; workstream — </w:t>
+      </w:r>
+      <w:r>
+        <w:rPr>
+          <w:sz w:val="21"/>
+          <w:szCs w:val="21"/>
+        </w:rPr>
+        <w:t xml:space="preserve">the classification an issue carries, e.g. Operations / Incidents. It is set automatically when work is created from a department page, shown as a chip wherever the issue appears, and changeable from the issue panel. It is a real field on the issue — not a label — so it cannot be lost by editing tags.</w:t>
+      </w:r>
+    </w:p>
+    <w:p>
+      <w:pPr>
+        <w:pStyle w:val="ListParagraph"/>
+        <w:numPr>
+          <w:ilvl w:val="0"/>
+          <w:numId w:val="2"/>
+        </w:numPr>
+        <w:spacing w:after="60"/>
+      </w:pPr>
+      <w:r>
+        <w:rPr>
+          <w:b/>
+          <w:bCs/>
+          <w:sz w:val="21"/>
+          <w:szCs w:val="21"/>
+        </w:rPr>
         <w:t xml:space="preserve">Workflow enforcement — </w:t>
       </w:r>
       <w:r>
@@ -1301,7 +1327,7 @@
           <w:sz w:val="24"/>
           <w:szCs w:val="24"/>
         </w:rPr>
-        <w:t xml:space="preserve">4.6 Find things fast</w:t>
+        <w:t xml:space="preserve">4.6 Classify work by department</w:t>
       </w:r>
     </w:p>
     <w:p>
@@ -1318,6 +1344,90 @@
           <w:sz w:val="21"/>
           <w:szCs w:val="21"/>
         </w:rPr>
+        <w:t xml:space="preserve">Create the item from its department page (Operations → Incidents, Development → Releases, and so on). The page header states the classification it applies, and every item created there is classified automatically.</w:t>
+      </w:r>
+    </w:p>
+    <w:p>
+      <w:pPr>
+        <w:pStyle w:val="ListParagraph"/>
+        <w:numPr>
+          <w:ilvl w:val="0"/>
+          <w:numId w:val="8"/>
+        </w:numPr>
+        <w:spacing w:after="60"/>
+      </w:pPr>
+      <w:r>
+        <w:rPr>
+          <w:sz w:val="21"/>
+          <w:szCs w:val="21"/>
+        </w:rPr>
+        <w:t xml:space="preserve">To see or change an existing item’s classification, open the issue and use the Department selector in the details panel; a second selector appears for the workstream once a department is chosen.</w:t>
+      </w:r>
+    </w:p>
+    <w:p>
+      <w:pPr>
+        <w:pStyle w:val="ListParagraph"/>
+        <w:numPr>
+          <w:ilvl w:val="0"/>
+          <w:numId w:val="8"/>
+        </w:numPr>
+        <w:spacing w:after="60"/>
+      </w:pPr>
+      <w:r>
+        <w:rPr>
+          <w:sz w:val="21"/>
+          <w:szCs w:val="21"/>
+        </w:rPr>
+        <w:t xml:space="preserve">Classified items show a chip (e.g. “Operations / Incidents”) on the board and list, so you can tell at a glance which department’s work you are looking at.</w:t>
+      </w:r>
+    </w:p>
+    <w:p>
+      <w:pPr>
+        <w:pStyle w:val="ListParagraph"/>
+        <w:numPr>
+          <w:ilvl w:val="0"/>
+          <w:numId w:val="8"/>
+        </w:numPr>
+        <w:spacing w:after="60"/>
+      </w:pPr>
+      <w:r>
+        <w:rPr>
+          <w:sz w:val="21"/>
+          <w:szCs w:val="21"/>
+        </w:rPr>
+        <w:t xml:space="preserve">Leaving an item unclassified is normal and correct — general project work belongs to no department.</w:t>
+      </w:r>
+    </w:p>
+    <w:p>
+      <w:pPr>
+        <w:pStyle w:val="Heading2"/>
+        <w:spacing w:after="120" w:before="240"/>
+      </w:pPr>
+      <w:r>
+        <w:rPr>
+          <w:b/>
+          <w:bCs/>
+          <w:color w:val="222222"/>
+          <w:sz w:val="24"/>
+          <w:szCs w:val="24"/>
+        </w:rPr>
+        <w:t xml:space="preserve">4.7 Find things fast</w:t>
+      </w:r>
+    </w:p>
+    <w:p>
+      <w:pPr>
+        <w:pStyle w:val="ListParagraph"/>
+        <w:numPr>
+          <w:ilvl w:val="0"/>
+          <w:numId w:val="9"/>
+        </w:numPr>
+        <w:spacing w:after="60"/>
+      </w:pPr>
+      <w:r>
+        <w:rPr>
+          <w:sz w:val="21"/>
+          <w:szCs w:val="21"/>
+        </w:rPr>
         <w:t xml:space="preserve">Tabs on the Issues page: Summary, List, Backlog, Sprints, Board, Epics, Hierarchy, Timeline, Team, Settings.</w:t>
       </w:r>
     </w:p>
@@ -1326,7 +1436,7 @@
         <w:pStyle w:val="ListParagraph"/>
         <w:numPr>
           <w:ilvl w:val="0"/>
-          <w:numId w:val="8"/>
+          <w:numId w:val="9"/>
         </w:numPr>
         <w:spacing w:after="60"/>
       </w:pPr>
@@ -1343,7 +1453,7 @@
         <w:pStyle w:val="ListParagraph"/>
         <w:numPr>
           <w:ilvl w:val="0"/>
-          <w:numId w:val="8"/>
+          <w:numId w:val="9"/>
         </w:numPr>
         <w:spacing w:after="60"/>
       </w:pPr>
@@ -1563,6 +1673,32 @@
           <w:szCs w:val="21"/>
         </w:rPr>
         <w:t xml:space="preserve">Issues can only move into a non-completed sprint of the same project; deleting a planned sprint returns its issues to the backlog. See the Sprints guide.</w:t>
+      </w:r>
+    </w:p>
+    <w:p>
+      <w:pPr>
+        <w:pStyle w:val="ListParagraph"/>
+        <w:numPr>
+          <w:ilvl w:val="0"/>
+          <w:numId w:val="2"/>
+        </w:numPr>
+        <w:spacing w:after="60"/>
+      </w:pPr>
+      <w:r>
+        <w:rPr>
+          <w:b/>
+          <w:bCs/>
+          <w:sz w:val="21"/>
+          <w:szCs w:val="21"/>
+        </w:rPr>
+        <w:t xml:space="preserve">Classification lives in its own field, not in labels. </w:t>
+      </w:r>
+      <w:r>
+        <w:rPr>
+          <w:sz w:val="21"/>
+          <w:szCs w:val="21"/>
+        </w:rPr>
+        <w:t xml:space="preserve">A department page shows exactly the items classified to it. Editing an issue’s labels can never remove it from its department, and every classification change is recorded in the activity history.</w:t>
       </w:r>
     </w:p>
     <w:p>
@@ -2263,6 +2399,180 @@
           </w:p>
         </w:tc>
       </w:tr>
+      <w:tr>
+        <w:tc>
+          <w:tcPr>
+            <w:tcW w:type="dxa" w:w="3400"/>
+            <w:tcBorders>
+              <w:top w:val="single" w:color="CCCCCC" w:sz="4"/>
+              <w:left w:val="single" w:color="CCCCCC" w:sz="4"/>
+              <w:bottom w:val="single" w:color="CCCCCC" w:sz="4"/>
+              <w:right w:val="single" w:color="CCCCCC" w:sz="4"/>
+            </w:tcBorders>
+            <w:tcMar>
+              <w:top w:type="dxa" w:w="60"/>
+              <w:left w:type="dxa" w:w="100"/>
+              <w:bottom w:type="dxa" w:w="60"/>
+              <w:right w:type="dxa" w:w="100"/>
+            </w:tcMar>
+          </w:tcPr>
+          <w:p>
+            <w:r>
+              <w:rPr>
+                <w:b w:val="false"/>
+                <w:bCs w:val="false"/>
+                <w:sz w:val="20"/>
+                <w:szCs w:val="20"/>
+              </w:rPr>
+              <w:t xml:space="preserve">"I created a task under Operations → Incidents and it also appears on the Issues page."</w:t>
+            </w:r>
+          </w:p>
+        </w:tc>
+        <w:tc>
+          <w:tcPr>
+            <w:tcW w:type="dxa" w:w="5960"/>
+            <w:tcBorders>
+              <w:top w:val="single" w:color="CCCCCC" w:sz="4"/>
+              <w:left w:val="single" w:color="CCCCCC" w:sz="4"/>
+              <w:bottom w:val="single" w:color="CCCCCC" w:sz="4"/>
+              <w:right w:val="single" w:color="CCCCCC" w:sz="4"/>
+            </w:tcBorders>
+            <w:tcMar>
+              <w:top w:type="dxa" w:w="60"/>
+              <w:left w:type="dxa" w:w="100"/>
+              <w:bottom w:type="dxa" w:w="60"/>
+              <w:right w:type="dxa" w:w="100"/>
+            </w:tcMar>
+          </w:tcPr>
+          <w:p>
+            <w:r>
+              <w:rPr>
+                <w:b w:val="false"/>
+                <w:bCs w:val="false"/>
+                <w:sz w:val="20"/>
+                <w:szCs w:val="20"/>
+              </w:rPr>
+              <w:t xml:space="preserve">Correct — there is one issue store. The department pages are filtered views of it. The task carries an Operations / Incidents classification (visible as a chip), which is what makes it appear on that department page.</w:t>
+            </w:r>
+          </w:p>
+        </w:tc>
+      </w:tr>
+      <w:tr>
+        <w:tc>
+          <w:tcPr>
+            <w:tcW w:type="dxa" w:w="3400"/>
+            <w:tcBorders>
+              <w:top w:val="single" w:color="CCCCCC" w:sz="4"/>
+              <w:left w:val="single" w:color="CCCCCC" w:sz="4"/>
+              <w:bottom w:val="single" w:color="CCCCCC" w:sz="4"/>
+              <w:right w:val="single" w:color="CCCCCC" w:sz="4"/>
+            </w:tcBorders>
+            <w:tcMar>
+              <w:top w:type="dxa" w:w="60"/>
+              <w:left w:type="dxa" w:w="100"/>
+              <w:bottom w:type="dxa" w:w="60"/>
+              <w:right w:type="dxa" w:w="100"/>
+            </w:tcMar>
+          </w:tcPr>
+          <w:p>
+            <w:r>
+              <w:rPr>
+                <w:b w:val="false"/>
+                <w:bCs w:val="false"/>
+                <w:sz w:val="20"/>
+                <w:szCs w:val="20"/>
+              </w:rPr>
+              <w:t xml:space="preserve">"How do I know which department an issue belongs to?"</w:t>
+            </w:r>
+          </w:p>
+        </w:tc>
+        <w:tc>
+          <w:tcPr>
+            <w:tcW w:type="dxa" w:w="5960"/>
+            <w:tcBorders>
+              <w:top w:val="single" w:color="CCCCCC" w:sz="4"/>
+              <w:left w:val="single" w:color="CCCCCC" w:sz="4"/>
+              <w:bottom w:val="single" w:color="CCCCCC" w:sz="4"/>
+              <w:right w:val="single" w:color="CCCCCC" w:sz="4"/>
+            </w:tcBorders>
+            <w:tcMar>
+              <w:top w:type="dxa" w:w="60"/>
+              <w:left w:type="dxa" w:w="100"/>
+              <w:bottom w:type="dxa" w:w="60"/>
+              <w:right w:type="dxa" w:w="100"/>
+            </w:tcMar>
+          </w:tcPr>
+          <w:p>
+            <w:r>
+              <w:rPr>
+                <w:b w:val="false"/>
+                <w:bCs w:val="false"/>
+                <w:sz w:val="20"/>
+                <w:szCs w:val="20"/>
+              </w:rPr>
+              <w:t xml:space="preserve">The chip on the board/list card, and the Department field in the issue panel. Items with no chip are general project work.</w:t>
+            </w:r>
+          </w:p>
+        </w:tc>
+      </w:tr>
+      <w:tr>
+        <w:tc>
+          <w:tcPr>
+            <w:tcW w:type="dxa" w:w="3400"/>
+            <w:tcBorders>
+              <w:top w:val="single" w:color="CCCCCC" w:sz="4"/>
+              <w:left w:val="single" w:color="CCCCCC" w:sz="4"/>
+              <w:bottom w:val="single" w:color="CCCCCC" w:sz="4"/>
+              <w:right w:val="single" w:color="CCCCCC" w:sz="4"/>
+            </w:tcBorders>
+            <w:tcMar>
+              <w:top w:type="dxa" w:w="60"/>
+              <w:left w:type="dxa" w:w="100"/>
+              <w:bottom w:type="dxa" w:w="60"/>
+              <w:right w:type="dxa" w:w="100"/>
+            </w:tcMar>
+          </w:tcPr>
+          <w:p>
+            <w:r>
+              <w:rPr>
+                <w:b w:val="false"/>
+                <w:bCs w:val="false"/>
+                <w:sz w:val="20"/>
+                <w:szCs w:val="20"/>
+              </w:rPr>
+              <w:t xml:space="preserve">"Can I move an item to a different department?"</w:t>
+            </w:r>
+          </w:p>
+        </w:tc>
+        <w:tc>
+          <w:tcPr>
+            <w:tcW w:type="dxa" w:w="5960"/>
+            <w:tcBorders>
+              <w:top w:val="single" w:color="CCCCCC" w:sz="4"/>
+              <w:left w:val="single" w:color="CCCCCC" w:sz="4"/>
+              <w:bottom w:val="single" w:color="CCCCCC" w:sz="4"/>
+              <w:right w:val="single" w:color="CCCCCC" w:sz="4"/>
+            </w:tcBorders>
+            <w:tcMar>
+              <w:top w:type="dxa" w:w="60"/>
+              <w:left w:type="dxa" w:w="100"/>
+              <w:bottom w:type="dxa" w:w="60"/>
+              <w:right w:type="dxa" w:w="100"/>
+            </w:tcMar>
+          </w:tcPr>
+          <w:p>
+            <w:r>
+              <w:rPr>
+                <w:b w:val="false"/>
+                <w:bCs w:val="false"/>
+                <w:sz w:val="20"/>
+                <w:szCs w:val="20"/>
+              </w:rPr>
+              <w:t xml:space="preserve">Yes — open the issue and change the Department selector. Choosing a new department clears the old workstream so a mismatched pair can never be stored. The change is recorded in the activity history.</w:t>
+            </w:r>
+          </w:p>
+        </w:tc>
+      </w:tr>
     </w:tbl>
     <w:p>
       <w:pPr>
@@ -2580,6 +2890,23 @@
           <w:szCs w:val="21"/>
         </w:rPr>
         <w:t xml:space="preserve">Deletes are soft (deletedAt); attachments, comments, watchers, and activity ride on the issue record. Automations and webhooks fire on create/update events.</w:t>
+      </w:r>
+    </w:p>
+    <w:p>
+      <w:pPr>
+        <w:pStyle w:val="ListParagraph"/>
+        <w:numPr>
+          <w:ilvl w:val="0"/>
+          <w:numId w:val="2"/>
+        </w:numPr>
+        <w:spacing w:after="60"/>
+      </w:pPr>
+      <w:r>
+        <w:rPr>
+          <w:sz w:val="21"/>
+          <w:szCs w:val="21"/>
+        </w:rPr>
+        <w:t xml:space="preserve">Classification: department/workstream are first-class indexed fields on the issue, validated against a fixed catalog (4 departments, 14 workstreams). Department pages create and filter on them; labels are free-form user tags with no structural meaning. Changing a classification emits an audited activity event recording old → new.</w:t>
       </w:r>
     </w:p>
     <w:p>
@@ -3018,6 +3345,64 @@
                 <w:szCs w:val="20"/>
               </w:rPr>
               <w:t xml:space="preserve">Press C, or + Create → Issue</w:t>
+            </w:r>
+          </w:p>
+        </w:tc>
+      </w:tr>
+      <w:tr>
+        <w:tc>
+          <w:tcPr>
+            <w:tcW w:type="dxa" w:w="4200"/>
+            <w:tcBorders>
+              <w:top w:val="single" w:color="CCCCCC" w:sz="4"/>
+              <w:left w:val="single" w:color="CCCCCC" w:sz="4"/>
+              <w:bottom w:val="single" w:color="CCCCCC" w:sz="4"/>
+              <w:right w:val="single" w:color="CCCCCC" w:sz="4"/>
+            </w:tcBorders>
+            <w:tcMar>
+              <w:top w:type="dxa" w:w="60"/>
+              <w:left w:type="dxa" w:w="100"/>
+              <w:bottom w:type="dxa" w:w="60"/>
+              <w:right w:type="dxa" w:w="100"/>
+            </w:tcMar>
+          </w:tcPr>
+          <w:p>
+            <w:r>
+              <w:rPr>
+                <w:b w:val="false"/>
+                <w:bCs w:val="false"/>
+                <w:sz w:val="20"/>
+                <w:szCs w:val="20"/>
+              </w:rPr>
+              <w:t xml:space="preserve">See or change an issue’s department</w:t>
+            </w:r>
+          </w:p>
+        </w:tc>
+        <w:tc>
+          <w:tcPr>
+            <w:tcW w:type="dxa" w:w="5160"/>
+            <w:tcBorders>
+              <w:top w:val="single" w:color="CCCCCC" w:sz="4"/>
+              <w:left w:val="single" w:color="CCCCCC" w:sz="4"/>
+              <w:bottom w:val="single" w:color="CCCCCC" w:sz="4"/>
+              <w:right w:val="single" w:color="CCCCCC" w:sz="4"/>
+            </w:tcBorders>
+            <w:tcMar>
+              <w:top w:type="dxa" w:w="60"/>
+              <w:left w:type="dxa" w:w="100"/>
+              <w:bottom w:type="dxa" w:w="60"/>
+              <w:right w:type="dxa" w:w="100"/>
+            </w:tcMar>
+          </w:tcPr>
+          <w:p>
+            <w:r>
+              <w:rPr>
+                <w:b w:val="false"/>
+                <w:bCs w:val="false"/>
+                <w:sz w:val="20"/>
+                <w:szCs w:val="20"/>
+              </w:rPr>
+              <w:t xml:space="preserve">Open the issue → Details panel → Department</w:t>
             </w:r>
           </w:p>
         </w:tc>
@@ -3675,7 +4060,13 @@
     </w:lvlOverride>
   </w:num>
   <w:num w:numId="8">
-    <w:abstractNumId w:val="8"/>
+    <w:abstractNumId w:val="9"/>
+    <w:lvlOverride w:ilvl="0">
+      <w:startOverride w:val="1"/>
+    </w:lvlOverride>
+  </w:num>
+  <w:num w:numId="9">
+    <w:abstractNumId w:val="10"/>
     <w:lvlOverride w:ilvl="0">
       <w:startOverride w:val="1"/>
     </w:lvlOverride>

</xml_diff>

<commit_message>
feat: classification visible everywhere - Phase 3 completes the department architecture (#170)
DepartmentChip on Issues and Board cards (silent for unclassified work); slideout Department/Workstream controlled catalog selectors with stale-workstream clearing; WORKSTREAM_LABEL_KEYS reuses sidebar i18n keys with invariant tests; D4 legacy-label fallback removed; Projects/Issues support guide regenerated to v1.1 in the same PR per the docs versioning rule. 348 tests green.
</commit_message>
<xml_diff>
--- a/docs/support/ONEKOF_SUPPORT_GUIDE_PROJECTS_ISSUES_BOARDS.docx
+++ b/docs/support/ONEKOF_SUPPORT_GUIDE_PROJECTS_ISSUES_BOARDS.docx
@@ -109,7 +109,7 @@
           <w:sz w:val="21"/>
           <w:szCs w:val="21"/>
         </w:rPr>
-        <w:t xml:space="preserve">Version 1.0 · July 25, 2026</w:t>
+        <w:t xml:space="preserve">Version 1.1 · July 25, 2026</w:t>
       </w:r>
     </w:p>
     <w:p>
@@ -875,6 +875,32 @@
           <w:sz w:val="21"/>
           <w:szCs w:val="21"/>
         </w:rPr>
+        <w:t xml:space="preserve">Department &amp; workstream — </w:t>
+      </w:r>
+      <w:r>
+        <w:rPr>
+          <w:sz w:val="21"/>
+          <w:szCs w:val="21"/>
+        </w:rPr>
+        <w:t xml:space="preserve">the classification an issue carries, e.g. Operations / Incidents. It is set automatically when work is created from a department page, shown as a chip wherever the issue appears, and changeable from the issue panel. It is a real field on the issue — not a label — so it cannot be lost by editing tags.</w:t>
+      </w:r>
+    </w:p>
+    <w:p>
+      <w:pPr>
+        <w:pStyle w:val="ListParagraph"/>
+        <w:numPr>
+          <w:ilvl w:val="0"/>
+          <w:numId w:val="2"/>
+        </w:numPr>
+        <w:spacing w:after="60"/>
+      </w:pPr>
+      <w:r>
+        <w:rPr>
+          <w:b/>
+          <w:bCs/>
+          <w:sz w:val="21"/>
+          <w:szCs w:val="21"/>
+        </w:rPr>
         <w:t xml:space="preserve">Workflow enforcement — </w:t>
       </w:r>
       <w:r>
@@ -1301,7 +1327,7 @@
           <w:sz w:val="24"/>
           <w:szCs w:val="24"/>
         </w:rPr>
-        <w:t xml:space="preserve">4.6 Find things fast</w:t>
+        <w:t xml:space="preserve">4.6 Classify work by department</w:t>
       </w:r>
     </w:p>
     <w:p>
@@ -1318,6 +1344,90 @@
           <w:sz w:val="21"/>
           <w:szCs w:val="21"/>
         </w:rPr>
+        <w:t xml:space="preserve">Create the item from its department page (Operations → Incidents, Development → Releases, and so on). The page header states the classification it applies, and every item created there is classified automatically.</w:t>
+      </w:r>
+    </w:p>
+    <w:p>
+      <w:pPr>
+        <w:pStyle w:val="ListParagraph"/>
+        <w:numPr>
+          <w:ilvl w:val="0"/>
+          <w:numId w:val="8"/>
+        </w:numPr>
+        <w:spacing w:after="60"/>
+      </w:pPr>
+      <w:r>
+        <w:rPr>
+          <w:sz w:val="21"/>
+          <w:szCs w:val="21"/>
+        </w:rPr>
+        <w:t xml:space="preserve">To see or change an existing item’s classification, open the issue and use the Department selector in the details panel; a second selector appears for the workstream once a department is chosen.</w:t>
+      </w:r>
+    </w:p>
+    <w:p>
+      <w:pPr>
+        <w:pStyle w:val="ListParagraph"/>
+        <w:numPr>
+          <w:ilvl w:val="0"/>
+          <w:numId w:val="8"/>
+        </w:numPr>
+        <w:spacing w:after="60"/>
+      </w:pPr>
+      <w:r>
+        <w:rPr>
+          <w:sz w:val="21"/>
+          <w:szCs w:val="21"/>
+        </w:rPr>
+        <w:t xml:space="preserve">Classified items show a chip (e.g. “Operations / Incidents”) on the board and list, so you can tell at a glance which department’s work you are looking at.</w:t>
+      </w:r>
+    </w:p>
+    <w:p>
+      <w:pPr>
+        <w:pStyle w:val="ListParagraph"/>
+        <w:numPr>
+          <w:ilvl w:val="0"/>
+          <w:numId w:val="8"/>
+        </w:numPr>
+        <w:spacing w:after="60"/>
+      </w:pPr>
+      <w:r>
+        <w:rPr>
+          <w:sz w:val="21"/>
+          <w:szCs w:val="21"/>
+        </w:rPr>
+        <w:t xml:space="preserve">Leaving an item unclassified is normal and correct — general project work belongs to no department.</w:t>
+      </w:r>
+    </w:p>
+    <w:p>
+      <w:pPr>
+        <w:pStyle w:val="Heading2"/>
+        <w:spacing w:after="120" w:before="240"/>
+      </w:pPr>
+      <w:r>
+        <w:rPr>
+          <w:b/>
+          <w:bCs/>
+          <w:color w:val="222222"/>
+          <w:sz w:val="24"/>
+          <w:szCs w:val="24"/>
+        </w:rPr>
+        <w:t xml:space="preserve">4.7 Find things fast</w:t>
+      </w:r>
+    </w:p>
+    <w:p>
+      <w:pPr>
+        <w:pStyle w:val="ListParagraph"/>
+        <w:numPr>
+          <w:ilvl w:val="0"/>
+          <w:numId w:val="9"/>
+        </w:numPr>
+        <w:spacing w:after="60"/>
+      </w:pPr>
+      <w:r>
+        <w:rPr>
+          <w:sz w:val="21"/>
+          <w:szCs w:val="21"/>
+        </w:rPr>
         <w:t xml:space="preserve">Tabs on the Issues page: Summary, List, Backlog, Sprints, Board, Epics, Hierarchy, Timeline, Team, Settings.</w:t>
       </w:r>
     </w:p>
@@ -1326,7 +1436,7 @@
         <w:pStyle w:val="ListParagraph"/>
         <w:numPr>
           <w:ilvl w:val="0"/>
-          <w:numId w:val="8"/>
+          <w:numId w:val="9"/>
         </w:numPr>
         <w:spacing w:after="60"/>
       </w:pPr>
@@ -1343,7 +1453,7 @@
         <w:pStyle w:val="ListParagraph"/>
         <w:numPr>
           <w:ilvl w:val="0"/>
-          <w:numId w:val="8"/>
+          <w:numId w:val="9"/>
         </w:numPr>
         <w:spacing w:after="60"/>
       </w:pPr>
@@ -1563,6 +1673,32 @@
           <w:szCs w:val="21"/>
         </w:rPr>
         <w:t xml:space="preserve">Issues can only move into a non-completed sprint of the same project; deleting a planned sprint returns its issues to the backlog. See the Sprints guide.</w:t>
+      </w:r>
+    </w:p>
+    <w:p>
+      <w:pPr>
+        <w:pStyle w:val="ListParagraph"/>
+        <w:numPr>
+          <w:ilvl w:val="0"/>
+          <w:numId w:val="2"/>
+        </w:numPr>
+        <w:spacing w:after="60"/>
+      </w:pPr>
+      <w:r>
+        <w:rPr>
+          <w:b/>
+          <w:bCs/>
+          <w:sz w:val="21"/>
+          <w:szCs w:val="21"/>
+        </w:rPr>
+        <w:t xml:space="preserve">Classification lives in its own field, not in labels. </w:t>
+      </w:r>
+      <w:r>
+        <w:rPr>
+          <w:sz w:val="21"/>
+          <w:szCs w:val="21"/>
+        </w:rPr>
+        <w:t xml:space="preserve">A department page shows exactly the items classified to it. Editing an issue’s labels can never remove it from its department, and every classification change is recorded in the activity history.</w:t>
       </w:r>
     </w:p>
     <w:p>
@@ -2263,6 +2399,180 @@
           </w:p>
         </w:tc>
       </w:tr>
+      <w:tr>
+        <w:tc>
+          <w:tcPr>
+            <w:tcW w:type="dxa" w:w="3400"/>
+            <w:tcBorders>
+              <w:top w:val="single" w:color="CCCCCC" w:sz="4"/>
+              <w:left w:val="single" w:color="CCCCCC" w:sz="4"/>
+              <w:bottom w:val="single" w:color="CCCCCC" w:sz="4"/>
+              <w:right w:val="single" w:color="CCCCCC" w:sz="4"/>
+            </w:tcBorders>
+            <w:tcMar>
+              <w:top w:type="dxa" w:w="60"/>
+              <w:left w:type="dxa" w:w="100"/>
+              <w:bottom w:type="dxa" w:w="60"/>
+              <w:right w:type="dxa" w:w="100"/>
+            </w:tcMar>
+          </w:tcPr>
+          <w:p>
+            <w:r>
+              <w:rPr>
+                <w:b w:val="false"/>
+                <w:bCs w:val="false"/>
+                <w:sz w:val="20"/>
+                <w:szCs w:val="20"/>
+              </w:rPr>
+              <w:t xml:space="preserve">"I created a task under Operations → Incidents and it also appears on the Issues page."</w:t>
+            </w:r>
+          </w:p>
+        </w:tc>
+        <w:tc>
+          <w:tcPr>
+            <w:tcW w:type="dxa" w:w="5960"/>
+            <w:tcBorders>
+              <w:top w:val="single" w:color="CCCCCC" w:sz="4"/>
+              <w:left w:val="single" w:color="CCCCCC" w:sz="4"/>
+              <w:bottom w:val="single" w:color="CCCCCC" w:sz="4"/>
+              <w:right w:val="single" w:color="CCCCCC" w:sz="4"/>
+            </w:tcBorders>
+            <w:tcMar>
+              <w:top w:type="dxa" w:w="60"/>
+              <w:left w:type="dxa" w:w="100"/>
+              <w:bottom w:type="dxa" w:w="60"/>
+              <w:right w:type="dxa" w:w="100"/>
+            </w:tcMar>
+          </w:tcPr>
+          <w:p>
+            <w:r>
+              <w:rPr>
+                <w:b w:val="false"/>
+                <w:bCs w:val="false"/>
+                <w:sz w:val="20"/>
+                <w:szCs w:val="20"/>
+              </w:rPr>
+              <w:t xml:space="preserve">Correct — there is one issue store. The department pages are filtered views of it. The task carries an Operations / Incidents classification (visible as a chip), which is what makes it appear on that department page.</w:t>
+            </w:r>
+          </w:p>
+        </w:tc>
+      </w:tr>
+      <w:tr>
+        <w:tc>
+          <w:tcPr>
+            <w:tcW w:type="dxa" w:w="3400"/>
+            <w:tcBorders>
+              <w:top w:val="single" w:color="CCCCCC" w:sz="4"/>
+              <w:left w:val="single" w:color="CCCCCC" w:sz="4"/>
+              <w:bottom w:val="single" w:color="CCCCCC" w:sz="4"/>
+              <w:right w:val="single" w:color="CCCCCC" w:sz="4"/>
+            </w:tcBorders>
+            <w:tcMar>
+              <w:top w:type="dxa" w:w="60"/>
+              <w:left w:type="dxa" w:w="100"/>
+              <w:bottom w:type="dxa" w:w="60"/>
+              <w:right w:type="dxa" w:w="100"/>
+            </w:tcMar>
+          </w:tcPr>
+          <w:p>
+            <w:r>
+              <w:rPr>
+                <w:b w:val="false"/>
+                <w:bCs w:val="false"/>
+                <w:sz w:val="20"/>
+                <w:szCs w:val="20"/>
+              </w:rPr>
+              <w:t xml:space="preserve">"How do I know which department an issue belongs to?"</w:t>
+            </w:r>
+          </w:p>
+        </w:tc>
+        <w:tc>
+          <w:tcPr>
+            <w:tcW w:type="dxa" w:w="5960"/>
+            <w:tcBorders>
+              <w:top w:val="single" w:color="CCCCCC" w:sz="4"/>
+              <w:left w:val="single" w:color="CCCCCC" w:sz="4"/>
+              <w:bottom w:val="single" w:color="CCCCCC" w:sz="4"/>
+              <w:right w:val="single" w:color="CCCCCC" w:sz="4"/>
+            </w:tcBorders>
+            <w:tcMar>
+              <w:top w:type="dxa" w:w="60"/>
+              <w:left w:type="dxa" w:w="100"/>
+              <w:bottom w:type="dxa" w:w="60"/>
+              <w:right w:type="dxa" w:w="100"/>
+            </w:tcMar>
+          </w:tcPr>
+          <w:p>
+            <w:r>
+              <w:rPr>
+                <w:b w:val="false"/>
+                <w:bCs w:val="false"/>
+                <w:sz w:val="20"/>
+                <w:szCs w:val="20"/>
+              </w:rPr>
+              <w:t xml:space="preserve">The chip on the board/list card, and the Department field in the issue panel. Items with no chip are general project work.</w:t>
+            </w:r>
+          </w:p>
+        </w:tc>
+      </w:tr>
+      <w:tr>
+        <w:tc>
+          <w:tcPr>
+            <w:tcW w:type="dxa" w:w="3400"/>
+            <w:tcBorders>
+              <w:top w:val="single" w:color="CCCCCC" w:sz="4"/>
+              <w:left w:val="single" w:color="CCCCCC" w:sz="4"/>
+              <w:bottom w:val="single" w:color="CCCCCC" w:sz="4"/>
+              <w:right w:val="single" w:color="CCCCCC" w:sz="4"/>
+            </w:tcBorders>
+            <w:tcMar>
+              <w:top w:type="dxa" w:w="60"/>
+              <w:left w:type="dxa" w:w="100"/>
+              <w:bottom w:type="dxa" w:w="60"/>
+              <w:right w:type="dxa" w:w="100"/>
+            </w:tcMar>
+          </w:tcPr>
+          <w:p>
+            <w:r>
+              <w:rPr>
+                <w:b w:val="false"/>
+                <w:bCs w:val="false"/>
+                <w:sz w:val="20"/>
+                <w:szCs w:val="20"/>
+              </w:rPr>
+              <w:t xml:space="preserve">"Can I move an item to a different department?"</w:t>
+            </w:r>
+          </w:p>
+        </w:tc>
+        <w:tc>
+          <w:tcPr>
+            <w:tcW w:type="dxa" w:w="5960"/>
+            <w:tcBorders>
+              <w:top w:val="single" w:color="CCCCCC" w:sz="4"/>
+              <w:left w:val="single" w:color="CCCCCC" w:sz="4"/>
+              <w:bottom w:val="single" w:color="CCCCCC" w:sz="4"/>
+              <w:right w:val="single" w:color="CCCCCC" w:sz="4"/>
+            </w:tcBorders>
+            <w:tcMar>
+              <w:top w:type="dxa" w:w="60"/>
+              <w:left w:type="dxa" w:w="100"/>
+              <w:bottom w:type="dxa" w:w="60"/>
+              <w:right w:type="dxa" w:w="100"/>
+            </w:tcMar>
+          </w:tcPr>
+          <w:p>
+            <w:r>
+              <w:rPr>
+                <w:b w:val="false"/>
+                <w:bCs w:val="false"/>
+                <w:sz w:val="20"/>
+                <w:szCs w:val="20"/>
+              </w:rPr>
+              <w:t xml:space="preserve">Yes — open the issue and change the Department selector. Choosing a new department clears the old workstream so a mismatched pair can never be stored. The change is recorded in the activity history.</w:t>
+            </w:r>
+          </w:p>
+        </w:tc>
+      </w:tr>
     </w:tbl>
     <w:p>
       <w:pPr>
@@ -2580,6 +2890,23 @@
           <w:szCs w:val="21"/>
         </w:rPr>
         <w:t xml:space="preserve">Deletes are soft (deletedAt); attachments, comments, watchers, and activity ride on the issue record. Automations and webhooks fire on create/update events.</w:t>
+      </w:r>
+    </w:p>
+    <w:p>
+      <w:pPr>
+        <w:pStyle w:val="ListParagraph"/>
+        <w:numPr>
+          <w:ilvl w:val="0"/>
+          <w:numId w:val="2"/>
+        </w:numPr>
+        <w:spacing w:after="60"/>
+      </w:pPr>
+      <w:r>
+        <w:rPr>
+          <w:sz w:val="21"/>
+          <w:szCs w:val="21"/>
+        </w:rPr>
+        <w:t xml:space="preserve">Classification: department/workstream are first-class indexed fields on the issue, validated against a fixed catalog (4 departments, 14 workstreams). Department pages create and filter on them; labels are free-form user tags with no structural meaning. Changing a classification emits an audited activity event recording old → new.</w:t>
       </w:r>
     </w:p>
     <w:p>
@@ -3018,6 +3345,64 @@
                 <w:szCs w:val="20"/>
               </w:rPr>
               <w:t xml:space="preserve">Press C, or + Create → Issue</w:t>
+            </w:r>
+          </w:p>
+        </w:tc>
+      </w:tr>
+      <w:tr>
+        <w:tc>
+          <w:tcPr>
+            <w:tcW w:type="dxa" w:w="4200"/>
+            <w:tcBorders>
+              <w:top w:val="single" w:color="CCCCCC" w:sz="4"/>
+              <w:left w:val="single" w:color="CCCCCC" w:sz="4"/>
+              <w:bottom w:val="single" w:color="CCCCCC" w:sz="4"/>
+              <w:right w:val="single" w:color="CCCCCC" w:sz="4"/>
+            </w:tcBorders>
+            <w:tcMar>
+              <w:top w:type="dxa" w:w="60"/>
+              <w:left w:type="dxa" w:w="100"/>
+              <w:bottom w:type="dxa" w:w="60"/>
+              <w:right w:type="dxa" w:w="100"/>
+            </w:tcMar>
+          </w:tcPr>
+          <w:p>
+            <w:r>
+              <w:rPr>
+                <w:b w:val="false"/>
+                <w:bCs w:val="false"/>
+                <w:sz w:val="20"/>
+                <w:szCs w:val="20"/>
+              </w:rPr>
+              <w:t xml:space="preserve">See or change an issue’s department</w:t>
+            </w:r>
+          </w:p>
+        </w:tc>
+        <w:tc>
+          <w:tcPr>
+            <w:tcW w:type="dxa" w:w="5160"/>
+            <w:tcBorders>
+              <w:top w:val="single" w:color="CCCCCC" w:sz="4"/>
+              <w:left w:val="single" w:color="CCCCCC" w:sz="4"/>
+              <w:bottom w:val="single" w:color="CCCCCC" w:sz="4"/>
+              <w:right w:val="single" w:color="CCCCCC" w:sz="4"/>
+            </w:tcBorders>
+            <w:tcMar>
+              <w:top w:type="dxa" w:w="60"/>
+              <w:left w:type="dxa" w:w="100"/>
+              <w:bottom w:type="dxa" w:w="60"/>
+              <w:right w:type="dxa" w:w="100"/>
+            </w:tcMar>
+          </w:tcPr>
+          <w:p>
+            <w:r>
+              <w:rPr>
+                <w:b w:val="false"/>
+                <w:bCs w:val="false"/>
+                <w:sz w:val="20"/>
+                <w:szCs w:val="20"/>
+              </w:rPr>
+              <w:t xml:space="preserve">Open the issue → Details panel → Department</w:t>
             </w:r>
           </w:p>
         </w:tc>
@@ -3675,7 +4060,13 @@
     </w:lvlOverride>
   </w:num>
   <w:num w:numId="8">
-    <w:abstractNumId w:val="8"/>
+    <w:abstractNumId w:val="9"/>
+    <w:lvlOverride w:ilvl="0">
+      <w:startOverride w:val="1"/>
+    </w:lvlOverride>
+  </w:num>
+  <w:num w:numId="9">
+    <w:abstractNumId w:val="10"/>
     <w:lvlOverride w:ilvl="0">
       <w:startOverride w:val="1"/>
     </w:lvlOverride>

</xml_diff>